<commit_message>
Add role-aligned database skills to CVs
</commit_message>
<xml_diff>
--- a/docs/CV Amirul Putra Justicia - Fullstack Developer - Indonesia.docx
+++ b/docs/CV Amirul Putra Justicia - Fullstack Developer - Indonesia.docx
@@ -203,6 +203,27 @@
           <w:sz w:val="18"/>
         </w:rPr>
         <w:t>JavaScript, TypeScript, Vue.js 3, React.js, Next.js, Tailwind CSS, WordPress/WooCommerce</w:t>
+      </w:r>
+    </w:p>
+    <w:p>
+      <w:pPr>
+        <w:spacing w:after="20" w:line="245" w:lineRule="auto"/>
+      </w:pPr>
+      <w:r>
+        <w:rPr>
+          <w:rFonts w:ascii="Arial" w:hAnsi="Arial"/>
+          <w:b/>
+          <w:color w:val="15365D"/>
+          <w:sz w:val="18"/>
+        </w:rPr>
+        <w:t xml:space="preserve">Role-aligned Skills: </w:t>
+      </w:r>
+      <w:r>
+        <w:rPr>
+          <w:rFonts w:ascii="Arial" w:hAnsi="Arial"/>
+          <w:sz w:val="18"/>
+        </w:rPr>
+        <w:t>JavaScript (Required), SQL (Preferred), MySQL administration (Preferred)</w:t>
       </w:r>
     </w:p>
     <w:p>

</xml_diff>